<commit_message>
Perbaiki verifikasi email dan sinkronisasi data mahasiswa
</commit_message>
<xml_diff>
--- a/resources/templates/skpi-template.docx
+++ b/resources/templates/skpi-template.docx
@@ -17,13 +17,19 @@
           <w:left w:w="10" w:type="dxa"/>
           <w:right w:w="10" w:type="dxa"/>
         </w:tblCellMar>
-        <w:tblLook w:val="0000" w:firstRow="0" w:lastRow="0" w:firstColumn="0" w:lastColumn="0" w:noHBand="0" w:noVBand="0"/>
+        <w:tblLook w:val="04A0" w:firstRow="1" w:lastRow="0" w:firstColumn="1" w:lastColumn="0" w:noHBand="0" w:noVBand="1"/>
       </w:tblPr>
       <w:tblGrid>
         <w:gridCol w:w="1400"/>
         <w:gridCol w:w="8400"/>
       </w:tblGrid>
       <w:tr>
+        <w:tblPrEx>
+          <w:tblCellMar>
+            <w:top w:w="0" w:type="dxa"/>
+            <w:bottom w:w="0" w:type="dxa"/>
+          </w:tblCellMar>
+        </w:tblPrEx>
         <w:tc>
           <w:tcPr>
             <w:tcW w:w="1400" w:type="dxa"/>
@@ -38,7 +44,7 @@
                 <w:noProof/>
               </w:rPr>
               <w:drawing>
-                <wp:inline distT="0" distB="0" distL="0" distR="0" wp14:anchorId="7A61A3BA" wp14:editId="0ED30A7D">
+                <wp:inline distT="0" distB="0" distL="0" distR="0" wp14:anchorId="531AA106" wp14:editId="3FA04BB4">
                   <wp:extent cx="666750" cy="781050"/>
                   <wp:effectExtent l="0" t="0" r="0" b="0"/>
                   <wp:docPr id="1" name="Picture 1"/>
@@ -306,6 +312,8 @@
         <w:spacing w:after="200"/>
         <w:jc w:val="both"/>
         <w:rPr>
+          <w:sz w:val="20"/>
+          <w:szCs w:val="20"/>
           <w:lang w:val="sv-SE"/>
         </w:rPr>
       </w:pPr>
@@ -348,13 +356,19 @@
           <w:left w:w="10" w:type="dxa"/>
           <w:right w:w="10" w:type="dxa"/>
         </w:tblCellMar>
-        <w:tblLook w:val="0000" w:firstRow="0" w:lastRow="0" w:firstColumn="0" w:lastColumn="0" w:noHBand="0" w:noVBand="0"/>
+        <w:tblLook w:val="04A0" w:firstRow="1" w:lastRow="0" w:firstColumn="1" w:lastColumn="0" w:noHBand="0" w:noVBand="1"/>
       </w:tblPr>
       <w:tblGrid>
         <w:gridCol w:w="3600"/>
         <w:gridCol w:w="6200"/>
       </w:tblGrid>
       <w:tr>
+        <w:tblPrEx>
+          <w:tblCellMar>
+            <w:top w:w="0" w:type="dxa"/>
+            <w:bottom w:w="0" w:type="dxa"/>
+          </w:tblCellMar>
+        </w:tblPrEx>
         <w:tc>
           <w:tcPr>
             <w:tcW w:w="3600" w:type="dxa"/>
@@ -401,18 +415,16 @@
             </w:tcMar>
             <w:vAlign w:val="center"/>
           </w:tcPr>
-          <w:p>
-            <w:r>
-              <w:rPr>
-                <w:sz w:val="20"/>
-                <w:szCs w:val="20"/>
-              </w:rPr>
-              <w:t>……………………………………………………</w:t>
-            </w:r>
-          </w:p>
+          <w:p/>
         </w:tc>
       </w:tr>
       <w:tr>
+        <w:tblPrEx>
+          <w:tblCellMar>
+            <w:top w:w="0" w:type="dxa"/>
+            <w:bottom w:w="0" w:type="dxa"/>
+          </w:tblCellMar>
+        </w:tblPrEx>
         <w:tc>
           <w:tcPr>
             <w:tcW w:w="3600" w:type="dxa"/>
@@ -479,18 +491,16 @@
             </w:tcMar>
             <w:vAlign w:val="center"/>
           </w:tcPr>
-          <w:p>
-            <w:r>
-              <w:rPr>
-                <w:sz w:val="20"/>
-                <w:szCs w:val="20"/>
-              </w:rPr>
-              <w:t>……………………………………………………</w:t>
-            </w:r>
-          </w:p>
+          <w:p/>
         </w:tc>
       </w:tr>
       <w:tr>
+        <w:tblPrEx>
+          <w:tblCellMar>
+            <w:top w:w="0" w:type="dxa"/>
+            <w:bottom w:w="0" w:type="dxa"/>
+          </w:tblCellMar>
+        </w:tblPrEx>
         <w:tc>
           <w:tcPr>
             <w:tcW w:w="3600" w:type="dxa"/>
@@ -568,18 +578,16 @@
             </w:tcMar>
             <w:vAlign w:val="center"/>
           </w:tcPr>
-          <w:p>
-            <w:r>
-              <w:rPr>
-                <w:sz w:val="20"/>
-                <w:szCs w:val="20"/>
-              </w:rPr>
-              <w:t>……………………………………………………</w:t>
-            </w:r>
-          </w:p>
+          <w:p/>
         </w:tc>
       </w:tr>
       <w:tr>
+        <w:tblPrEx>
+          <w:tblCellMar>
+            <w:top w:w="0" w:type="dxa"/>
+            <w:bottom w:w="0" w:type="dxa"/>
+          </w:tblCellMar>
+        </w:tblPrEx>
         <w:tc>
           <w:tcPr>
             <w:tcW w:w="3600" w:type="dxa"/>
@@ -626,18 +634,16 @@
             </w:tcMar>
             <w:vAlign w:val="center"/>
           </w:tcPr>
-          <w:p>
-            <w:r>
-              <w:rPr>
-                <w:sz w:val="20"/>
-                <w:szCs w:val="20"/>
-              </w:rPr>
-              <w:t>…………………</w:t>
-            </w:r>
-          </w:p>
+          <w:p/>
         </w:tc>
       </w:tr>
       <w:tr>
+        <w:tblPrEx>
+          <w:tblCellMar>
+            <w:top w:w="0" w:type="dxa"/>
+            <w:bottom w:w="0" w:type="dxa"/>
+          </w:tblCellMar>
+        </w:tblPrEx>
         <w:tc>
           <w:tcPr>
             <w:tcW w:w="3600" w:type="dxa"/>
@@ -684,18 +690,16 @@
             </w:tcMar>
             <w:vAlign w:val="center"/>
           </w:tcPr>
-          <w:p>
-            <w:r>
-              <w:rPr>
-                <w:sz w:val="20"/>
-                <w:szCs w:val="20"/>
-              </w:rPr>
-              <w:t>…………………</w:t>
-            </w:r>
-          </w:p>
+          <w:p/>
         </w:tc>
       </w:tr>
       <w:tr>
+        <w:tblPrEx>
+          <w:tblCellMar>
+            <w:top w:w="0" w:type="dxa"/>
+            <w:bottom w:w="0" w:type="dxa"/>
+          </w:tblCellMar>
+        </w:tblPrEx>
         <w:tc>
           <w:tcPr>
             <w:tcW w:w="3600" w:type="dxa"/>
@@ -742,18 +746,16 @@
             </w:tcMar>
             <w:vAlign w:val="center"/>
           </w:tcPr>
-          <w:p>
-            <w:r>
-              <w:rPr>
-                <w:sz w:val="20"/>
-                <w:szCs w:val="20"/>
-              </w:rPr>
-              <w:t>……………………………………………………</w:t>
-            </w:r>
-          </w:p>
+          <w:p/>
         </w:tc>
       </w:tr>
       <w:tr>
+        <w:tblPrEx>
+          <w:tblCellMar>
+            <w:top w:w="0" w:type="dxa"/>
+            <w:bottom w:w="0" w:type="dxa"/>
+          </w:tblCellMar>
+        </w:tblPrEx>
         <w:tc>
           <w:tcPr>
             <w:tcW w:w="3600" w:type="dxa"/>
@@ -789,21 +791,21 @@
             </w:tcMar>
             <w:vAlign w:val="center"/>
           </w:tcPr>
-          <w:p>
-            <w:r>
-              <w:rPr>
-                <w:sz w:val="20"/>
-                <w:szCs w:val="20"/>
-              </w:rPr>
-              <w:t>……………………………………………………</w:t>
-            </w:r>
-          </w:p>
+          <w:p/>
         </w:tc>
       </w:tr>
     </w:tbl>
     <w:p>
       <w:pPr>
         <w:spacing w:before="300" w:after="120"/>
+        <w:rPr>
+          <w:b/>
+          <w:bCs/>
+          <w:color w:val="000000"/>
+          <w:sz w:val="24"/>
+          <w:szCs w:val="24"/>
+          <w:lang w:val="sv-SE"/>
+        </w:rPr>
       </w:pPr>
     </w:p>
     <w:p>
@@ -2233,13 +2235,6 @@
     </w:p>
     <w:p>
       <w:pPr>
-        <w:pStyle w:val="ListParagraph"/>
-        <w:spacing w:after="80"/>
-        <w:ind w:left="400"/>
-      </w:pPr>
-    </w:p>
-    <w:p>
-      <w:pPr>
         <w:spacing w:before="200" w:after="100"/>
       </w:pPr>
       <w:r>
@@ -2421,7 +2416,7 @@
     </w:p>
     <w:tbl>
       <w:tblPr>
-        <w:tblW w:w="9800" w:type="dxa"/>
+        <w:tblW w:w="5000" w:type="pct"/>
         <w:tblBorders>
           <w:top w:val="single" w:sz="2" w:space="0" w:color="999999"/>
           <w:left w:val="single" w:sz="2" w:space="0" w:color="999999"/>
@@ -2434,22 +2429,28 @@
           <w:left w:w="10" w:type="dxa"/>
           <w:right w:w="10" w:type="dxa"/>
         </w:tblCellMar>
-        <w:tblLook w:val="0000" w:firstRow="0" w:lastRow="0" w:firstColumn="0" w:lastColumn="0" w:noHBand="0" w:noVBand="0"/>
+        <w:tblLook w:val="04A0" w:firstRow="1" w:lastRow="0" w:firstColumn="1" w:lastColumn="0" w:noHBand="0" w:noVBand="1"/>
       </w:tblPr>
       <w:tblGrid>
-        <w:gridCol w:w="500"/>
-        <w:gridCol w:w="3500"/>
-        <w:gridCol w:w="2900"/>
-        <w:gridCol w:w="1300"/>
-        <w:gridCol w:w="1600"/>
+        <w:gridCol w:w="594"/>
+        <w:gridCol w:w="4140"/>
+        <w:gridCol w:w="3430"/>
+        <w:gridCol w:w="1536"/>
       </w:tblGrid>
       <w:tr>
+        <w:tblPrEx>
+          <w:tblCellMar>
+            <w:top w:w="0" w:type="dxa"/>
+            <w:bottom w:w="0" w:type="dxa"/>
+          </w:tblCellMar>
+        </w:tblPrEx>
         <w:trPr>
+          <w:trHeight w:val="240"/>
           <w:tblHeader/>
         </w:trPr>
         <w:tc>
           <w:tcPr>
-            <w:tcW w:w="500" w:type="dxa"/>
+            <w:tcW w:w="306" w:type="pct"/>
             <w:shd w:val="clear" w:color="auto" w:fill="E8E8E8"/>
             <w:tcMar>
               <w:top w:w="80" w:type="dxa"/>
@@ -2476,7 +2477,7 @@
         </w:tc>
         <w:tc>
           <w:tcPr>
-            <w:tcW w:w="3500" w:type="dxa"/>
+            <w:tcW w:w="2134" w:type="pct"/>
             <w:shd w:val="clear" w:color="auto" w:fill="E8E8E8"/>
             <w:tcMar>
               <w:top w:w="80" w:type="dxa"/>
@@ -2514,7 +2515,7 @@
         </w:tc>
         <w:tc>
           <w:tcPr>
-            <w:tcW w:w="2900" w:type="dxa"/>
+            <w:tcW w:w="1768" w:type="pct"/>
             <w:shd w:val="clear" w:color="auto" w:fill="E8E8E8"/>
             <w:tcMar>
               <w:top w:w="80" w:type="dxa"/>
@@ -2543,7 +2544,7 @@
         </w:tc>
         <w:tc>
           <w:tcPr>
-            <w:tcW w:w="1300" w:type="dxa"/>
+            <w:tcW w:w="792" w:type="pct"/>
             <w:shd w:val="clear" w:color="auto" w:fill="E8E8E8"/>
             <w:tcMar>
               <w:top w:w="80" w:type="dxa"/>
@@ -2570,9 +2571,228 @@
             <w:proofErr w:type="spellEnd"/>
           </w:p>
         </w:tc>
+      </w:tr>
+      <w:tr>
+        <w:tblPrEx>
+          <w:tblCellMar>
+            <w:top w:w="0" w:type="dxa"/>
+            <w:bottom w:w="0" w:type="dxa"/>
+          </w:tblCellMar>
+        </w:tblPrEx>
+        <w:trPr>
+          <w:trHeight w:val="260"/>
+        </w:trPr>
         <w:tc>
           <w:tcPr>
-            <w:tcW w:w="1600" w:type="dxa"/>
+            <w:tcW w:w="306" w:type="pct"/>
+            <w:tcMar>
+              <w:top w:w="80" w:type="dxa"/>
+              <w:left w:w="100" w:type="dxa"/>
+              <w:bottom w:w="80" w:type="dxa"/>
+              <w:right w:w="100" w:type="dxa"/>
+            </w:tcMar>
+            <w:vAlign w:val="center"/>
+          </w:tcPr>
+          <w:p>
+            <w:pPr>
+              <w:jc w:val="center"/>
+            </w:pPr>
+            <w:r>
+              <w:rPr>
+                <w:sz w:val="20"/>
+                <w:szCs w:val="20"/>
+              </w:rPr>
+              <w:t>1</w:t>
+            </w:r>
+          </w:p>
+        </w:tc>
+        <w:tc>
+          <w:tcPr>
+            <w:tcW w:w="2134" w:type="pct"/>
+            <w:tcMar>
+              <w:top w:w="80" w:type="dxa"/>
+              <w:left w:w="100" w:type="dxa"/>
+              <w:bottom w:w="80" w:type="dxa"/>
+              <w:right w:w="100" w:type="dxa"/>
+            </w:tcMar>
+            <w:vAlign w:val="center"/>
+          </w:tcPr>
+          <w:p/>
+        </w:tc>
+        <w:tc>
+          <w:tcPr>
+            <w:tcW w:w="1768" w:type="pct"/>
+            <w:tcMar>
+              <w:top w:w="80" w:type="dxa"/>
+              <w:left w:w="100" w:type="dxa"/>
+              <w:bottom w:w="80" w:type="dxa"/>
+              <w:right w:w="100" w:type="dxa"/>
+            </w:tcMar>
+            <w:vAlign w:val="center"/>
+          </w:tcPr>
+          <w:p/>
+        </w:tc>
+        <w:tc>
+          <w:tcPr>
+            <w:tcW w:w="792" w:type="pct"/>
+            <w:tcMar>
+              <w:top w:w="80" w:type="dxa"/>
+              <w:left w:w="100" w:type="dxa"/>
+              <w:bottom w:w="80" w:type="dxa"/>
+              <w:right w:w="100" w:type="dxa"/>
+            </w:tcMar>
+            <w:vAlign w:val="center"/>
+          </w:tcPr>
+          <w:p>
+            <w:pPr>
+              <w:jc w:val="center"/>
+            </w:pPr>
+          </w:p>
+        </w:tc>
+      </w:tr>
+    </w:tbl>
+    <w:p>
+      <w:pPr>
+        <w:spacing w:before="200" w:after="100"/>
+      </w:pPr>
+      <w:r>
+        <w:rPr>
+          <w:b/>
+          <w:bCs/>
+          <w:color w:val="000000"/>
+        </w:rPr>
+        <w:t xml:space="preserve">B. </w:t>
+      </w:r>
+      <w:proofErr w:type="spellStart"/>
+      <w:r>
+        <w:rPr>
+          <w:b/>
+          <w:bCs/>
+          <w:color w:val="000000"/>
+        </w:rPr>
+        <w:t>Prestasi</w:t>
+      </w:r>
+      <w:proofErr w:type="spellEnd"/>
+      <w:r>
+        <w:rPr>
+          <w:b/>
+          <w:bCs/>
+          <w:color w:val="000000"/>
+        </w:rPr>
+        <w:t xml:space="preserve"> dan </w:t>
+      </w:r>
+      <w:proofErr w:type="spellStart"/>
+      <w:r>
+        <w:rPr>
+          <w:b/>
+          <w:bCs/>
+          <w:color w:val="000000"/>
+        </w:rPr>
+        <w:t>Penghargaan</w:t>
+      </w:r>
+      <w:proofErr w:type="spellEnd"/>
+    </w:p>
+    <w:tbl>
+      <w:tblPr>
+        <w:tblW w:w="5000" w:type="pct"/>
+        <w:tblBorders>
+          <w:top w:val="single" w:sz="2" w:space="0" w:color="999999"/>
+          <w:left w:val="single" w:sz="2" w:space="0" w:color="999999"/>
+          <w:bottom w:val="single" w:sz="2" w:space="0" w:color="999999"/>
+          <w:right w:val="single" w:sz="2" w:space="0" w:color="999999"/>
+          <w:insideH w:val="single" w:sz="2" w:space="0" w:color="999999"/>
+          <w:insideV w:val="single" w:sz="2" w:space="0" w:color="999999"/>
+        </w:tblBorders>
+        <w:tblCellMar>
+          <w:left w:w="10" w:type="dxa"/>
+          <w:right w:w="10" w:type="dxa"/>
+        </w:tblCellMar>
+        <w:tblLook w:val="04A0" w:firstRow="1" w:lastRow="0" w:firstColumn="1" w:lastColumn="0" w:noHBand="0" w:noVBand="1"/>
+      </w:tblPr>
+      <w:tblGrid>
+        <w:gridCol w:w="592"/>
+        <w:gridCol w:w="4140"/>
+        <w:gridCol w:w="3430"/>
+        <w:gridCol w:w="1538"/>
+      </w:tblGrid>
+      <w:tr>
+        <w:tblPrEx>
+          <w:tblCellMar>
+            <w:top w:w="0" w:type="dxa"/>
+            <w:bottom w:w="0" w:type="dxa"/>
+          </w:tblCellMar>
+        </w:tblPrEx>
+        <w:trPr>
+          <w:tblHeader/>
+        </w:trPr>
+        <w:tc>
+          <w:tcPr>
+            <w:tcW w:w="305" w:type="pct"/>
+            <w:shd w:val="clear" w:color="auto" w:fill="E8E8E8"/>
+            <w:tcMar>
+              <w:top w:w="80" w:type="dxa"/>
+              <w:left w:w="100" w:type="dxa"/>
+              <w:bottom w:w="80" w:type="dxa"/>
+              <w:right w:w="100" w:type="dxa"/>
+            </w:tcMar>
+            <w:vAlign w:val="center"/>
+          </w:tcPr>
+          <w:p>
+            <w:pPr>
+              <w:jc w:val="center"/>
+            </w:pPr>
+            <w:r>
+              <w:rPr>
+                <w:b/>
+                <w:bCs/>
+                <w:sz w:val="20"/>
+                <w:szCs w:val="20"/>
+              </w:rPr>
+              <w:t>No</w:t>
+            </w:r>
+          </w:p>
+        </w:tc>
+        <w:tc>
+          <w:tcPr>
+            <w:tcW w:w="2134" w:type="pct"/>
+            <w:shd w:val="clear" w:color="auto" w:fill="E8E8E8"/>
+            <w:tcMar>
+              <w:top w:w="80" w:type="dxa"/>
+              <w:left w:w="100" w:type="dxa"/>
+              <w:bottom w:w="80" w:type="dxa"/>
+              <w:right w:w="100" w:type="dxa"/>
+            </w:tcMar>
+            <w:vAlign w:val="center"/>
+          </w:tcPr>
+          <w:p>
+            <w:pPr>
+              <w:jc w:val="center"/>
+            </w:pPr>
+            <w:r>
+              <w:rPr>
+                <w:b/>
+                <w:bCs/>
+                <w:sz w:val="20"/>
+                <w:szCs w:val="20"/>
+              </w:rPr>
+              <w:t xml:space="preserve">Nama </w:t>
+            </w:r>
+            <w:proofErr w:type="spellStart"/>
+            <w:r>
+              <w:rPr>
+                <w:b/>
+                <w:bCs/>
+                <w:sz w:val="20"/>
+                <w:szCs w:val="20"/>
+              </w:rPr>
+              <w:t>Kegiatan</w:t>
+            </w:r>
+            <w:proofErr w:type="spellEnd"/>
+          </w:p>
+        </w:tc>
+        <w:tc>
+          <w:tcPr>
+            <w:tcW w:w="1768" w:type="pct"/>
             <w:shd w:val="clear" w:color="auto" w:fill="E8E8E8"/>
             <w:tcMar>
               <w:top w:w="80" w:type="dxa"/>
@@ -2594,275 +2814,14 @@
                 <w:sz w:val="20"/>
                 <w:szCs w:val="20"/>
               </w:rPr>
-              <w:t>Bobot</w:t>
-            </w:r>
-            <w:proofErr w:type="spellEnd"/>
-            <w:r>
-              <w:rPr>
-                <w:b/>
-                <w:bCs/>
-                <w:sz w:val="20"/>
-                <w:szCs w:val="20"/>
-              </w:rPr>
-              <w:t xml:space="preserve"> Nilai</w:t>
-            </w:r>
-          </w:p>
-        </w:tc>
-      </w:tr>
-      <w:tr>
-        <w:tc>
-          <w:tcPr>
-            <w:tcW w:w="500" w:type="dxa"/>
-            <w:tcMar>
-              <w:top w:w="80" w:type="dxa"/>
-              <w:left w:w="100" w:type="dxa"/>
-              <w:bottom w:w="80" w:type="dxa"/>
-              <w:right w:w="100" w:type="dxa"/>
-            </w:tcMar>
-            <w:vAlign w:val="center"/>
-          </w:tcPr>
-          <w:p>
-            <w:pPr>
-              <w:jc w:val="center"/>
-            </w:pPr>
-            <w:r>
-              <w:rPr>
-                <w:sz w:val="20"/>
-                <w:szCs w:val="20"/>
-              </w:rPr>
-              <w:t>1</w:t>
-            </w:r>
-          </w:p>
-        </w:tc>
-        <w:tc>
-          <w:tcPr>
-            <w:tcW w:w="3500" w:type="dxa"/>
-            <w:tcMar>
-              <w:top w:w="80" w:type="dxa"/>
-              <w:left w:w="100" w:type="dxa"/>
-              <w:bottom w:w="80" w:type="dxa"/>
-              <w:right w:w="100" w:type="dxa"/>
-            </w:tcMar>
-            <w:vAlign w:val="center"/>
-          </w:tcPr>
-          <w:p>
-            <w:r>
-              <w:rPr>
-                <w:sz w:val="20"/>
-                <w:szCs w:val="20"/>
-              </w:rPr>
-              <w:t>……………………………</w:t>
-            </w:r>
-          </w:p>
-        </w:tc>
-        <w:tc>
-          <w:tcPr>
-            <w:tcW w:w="2900" w:type="dxa"/>
-            <w:tcMar>
-              <w:top w:w="80" w:type="dxa"/>
-              <w:left w:w="100" w:type="dxa"/>
-              <w:bottom w:w="80" w:type="dxa"/>
-              <w:right w:w="100" w:type="dxa"/>
-            </w:tcMar>
-            <w:vAlign w:val="center"/>
-          </w:tcPr>
-          <w:p>
-            <w:r>
-              <w:rPr>
-                <w:sz w:val="20"/>
-                <w:szCs w:val="20"/>
-              </w:rPr>
-              <w:t>……………………………</w:t>
-            </w:r>
-          </w:p>
-        </w:tc>
-        <w:tc>
-          <w:tcPr>
-            <w:tcW w:w="1300" w:type="dxa"/>
-            <w:tcMar>
-              <w:top w:w="80" w:type="dxa"/>
-              <w:left w:w="100" w:type="dxa"/>
-              <w:bottom w:w="80" w:type="dxa"/>
-              <w:right w:w="100" w:type="dxa"/>
-            </w:tcMar>
-            <w:vAlign w:val="center"/>
-          </w:tcPr>
-          <w:p>
-            <w:pPr>
-              <w:jc w:val="center"/>
-            </w:pPr>
-            <w:r>
-              <w:rPr>
-                <w:sz w:val="20"/>
-                <w:szCs w:val="20"/>
-              </w:rPr>
-              <w:t>………</w:t>
-            </w:r>
-          </w:p>
-        </w:tc>
-        <w:tc>
-          <w:tcPr>
-            <w:tcW w:w="1600" w:type="dxa"/>
-            <w:tcMar>
-              <w:top w:w="80" w:type="dxa"/>
-              <w:left w:w="100" w:type="dxa"/>
-              <w:bottom w:w="80" w:type="dxa"/>
-              <w:right w:w="100" w:type="dxa"/>
-            </w:tcMar>
-            <w:vAlign w:val="center"/>
-          </w:tcPr>
-          <w:p>
-            <w:pPr>
-              <w:jc w:val="center"/>
-            </w:pPr>
-            <w:r>
-              <w:rPr>
-                <w:sz w:val="20"/>
-                <w:szCs w:val="20"/>
-              </w:rPr>
-              <w:t>………</w:t>
-            </w:r>
-          </w:p>
-        </w:tc>
-      </w:tr>
-    </w:tbl>
-    <w:p>
-      <w:pPr>
-        <w:spacing w:before="200" w:after="100"/>
-      </w:pPr>
-      <w:r>
-        <w:rPr>
-          <w:b/>
-          <w:bCs/>
-          <w:color w:val="000000"/>
-        </w:rPr>
-        <w:t xml:space="preserve">B. </w:t>
-      </w:r>
-      <w:proofErr w:type="spellStart"/>
-      <w:r>
-        <w:rPr>
-          <w:b/>
-          <w:bCs/>
-          <w:color w:val="000000"/>
-        </w:rPr>
-        <w:t>Prestasi</w:t>
-      </w:r>
-      <w:proofErr w:type="spellEnd"/>
-      <w:r>
-        <w:rPr>
-          <w:b/>
-          <w:bCs/>
-          <w:color w:val="000000"/>
-        </w:rPr>
-        <w:t xml:space="preserve"> dan </w:t>
-      </w:r>
-      <w:proofErr w:type="spellStart"/>
-      <w:r>
-        <w:rPr>
-          <w:b/>
-          <w:bCs/>
-          <w:color w:val="000000"/>
-        </w:rPr>
-        <w:t>Penghargaan</w:t>
-      </w:r>
-      <w:proofErr w:type="spellEnd"/>
-    </w:p>
-    <w:tbl>
-      <w:tblPr>
-        <w:tblW w:w="9800" w:type="dxa"/>
-        <w:tblBorders>
-          <w:top w:val="single" w:sz="2" w:space="0" w:color="999999"/>
-          <w:left w:val="single" w:sz="2" w:space="0" w:color="999999"/>
-          <w:bottom w:val="single" w:sz="2" w:space="0" w:color="999999"/>
-          <w:right w:val="single" w:sz="2" w:space="0" w:color="999999"/>
-          <w:insideH w:val="single" w:sz="2" w:space="0" w:color="999999"/>
-          <w:insideV w:val="single" w:sz="2" w:space="0" w:color="999999"/>
-        </w:tblBorders>
-        <w:tblCellMar>
-          <w:left w:w="10" w:type="dxa"/>
-          <w:right w:w="10" w:type="dxa"/>
-        </w:tblCellMar>
-        <w:tblLook w:val="0000" w:firstRow="0" w:lastRow="0" w:firstColumn="0" w:lastColumn="0" w:noHBand="0" w:noVBand="0"/>
-      </w:tblPr>
-      <w:tblGrid>
-        <w:gridCol w:w="500"/>
-        <w:gridCol w:w="3500"/>
-        <w:gridCol w:w="2900"/>
-        <w:gridCol w:w="1300"/>
-        <w:gridCol w:w="1600"/>
-      </w:tblGrid>
-      <w:tr>
-        <w:trPr>
-          <w:tblHeader/>
-        </w:trPr>
-        <w:tc>
-          <w:tcPr>
-            <w:tcW w:w="500" w:type="dxa"/>
-            <w:shd w:val="clear" w:color="auto" w:fill="E8E8E8"/>
-            <w:tcMar>
-              <w:top w:w="80" w:type="dxa"/>
-              <w:left w:w="100" w:type="dxa"/>
-              <w:bottom w:w="80" w:type="dxa"/>
-              <w:right w:w="100" w:type="dxa"/>
-            </w:tcMar>
-            <w:vAlign w:val="center"/>
-          </w:tcPr>
-          <w:p>
-            <w:pPr>
-              <w:jc w:val="center"/>
-            </w:pPr>
-            <w:r>
-              <w:rPr>
-                <w:b/>
-                <w:bCs/>
-                <w:sz w:val="20"/>
-                <w:szCs w:val="20"/>
-              </w:rPr>
-              <w:t>No</w:t>
-            </w:r>
-          </w:p>
-        </w:tc>
-        <w:tc>
-          <w:tcPr>
-            <w:tcW w:w="3500" w:type="dxa"/>
-            <w:shd w:val="clear" w:color="auto" w:fill="E8E8E8"/>
-            <w:tcMar>
-              <w:top w:w="80" w:type="dxa"/>
-              <w:left w:w="100" w:type="dxa"/>
-              <w:bottom w:w="80" w:type="dxa"/>
-              <w:right w:w="100" w:type="dxa"/>
-            </w:tcMar>
-            <w:vAlign w:val="center"/>
-          </w:tcPr>
-          <w:p>
-            <w:pPr>
-              <w:jc w:val="center"/>
-            </w:pPr>
-            <w:r>
-              <w:rPr>
-                <w:b/>
-                <w:bCs/>
-                <w:sz w:val="20"/>
-                <w:szCs w:val="20"/>
-              </w:rPr>
-              <w:t xml:space="preserve">Nama </w:t>
-            </w:r>
-            <w:proofErr w:type="spellStart"/>
-            <w:r>
-              <w:rPr>
-                <w:b/>
-                <w:bCs/>
-                <w:sz w:val="20"/>
-                <w:szCs w:val="20"/>
-              </w:rPr>
-              <w:t>Kegiatan</w:t>
+              <w:t>Penyelenggara</w:t>
             </w:r>
             <w:proofErr w:type="spellEnd"/>
           </w:p>
         </w:tc>
         <w:tc>
           <w:tcPr>
-            <w:tcW w:w="2900" w:type="dxa"/>
+            <w:tcW w:w="793" w:type="pct"/>
             <w:shd w:val="clear" w:color="auto" w:fill="E8E8E8"/>
             <w:tcMar>
               <w:top w:w="80" w:type="dxa"/>
@@ -2884,14 +2843,266 @@
                 <w:sz w:val="20"/>
                 <w:szCs w:val="20"/>
               </w:rPr>
-              <w:t>Penyelenggara</w:t>
+              <w:t>Tahun</w:t>
+            </w:r>
+            <w:proofErr w:type="spellEnd"/>
+          </w:p>
+        </w:tc>
+      </w:tr>
+      <w:tr>
+        <w:tblPrEx>
+          <w:tblCellMar>
+            <w:top w:w="0" w:type="dxa"/>
+            <w:bottom w:w="0" w:type="dxa"/>
+          </w:tblCellMar>
+        </w:tblPrEx>
+        <w:tc>
+          <w:tcPr>
+            <w:tcW w:w="305" w:type="pct"/>
+            <w:tcMar>
+              <w:top w:w="80" w:type="dxa"/>
+              <w:left w:w="100" w:type="dxa"/>
+              <w:bottom w:w="80" w:type="dxa"/>
+              <w:right w:w="100" w:type="dxa"/>
+            </w:tcMar>
+            <w:vAlign w:val="center"/>
+          </w:tcPr>
+          <w:p>
+            <w:pPr>
+              <w:jc w:val="center"/>
+            </w:pPr>
+            <w:r>
+              <w:rPr>
+                <w:sz w:val="20"/>
+                <w:szCs w:val="20"/>
+              </w:rPr>
+              <w:t>1</w:t>
+            </w:r>
+          </w:p>
+        </w:tc>
+        <w:tc>
+          <w:tcPr>
+            <w:tcW w:w="2134" w:type="pct"/>
+            <w:tcMar>
+              <w:top w:w="80" w:type="dxa"/>
+              <w:left w:w="100" w:type="dxa"/>
+              <w:bottom w:w="80" w:type="dxa"/>
+              <w:right w:w="100" w:type="dxa"/>
+            </w:tcMar>
+            <w:vAlign w:val="center"/>
+          </w:tcPr>
+          <w:p/>
+        </w:tc>
+        <w:tc>
+          <w:tcPr>
+            <w:tcW w:w="1768" w:type="pct"/>
+            <w:tcMar>
+              <w:top w:w="80" w:type="dxa"/>
+              <w:left w:w="100" w:type="dxa"/>
+              <w:bottom w:w="80" w:type="dxa"/>
+              <w:right w:w="100" w:type="dxa"/>
+            </w:tcMar>
+            <w:vAlign w:val="center"/>
+          </w:tcPr>
+          <w:p/>
+        </w:tc>
+        <w:tc>
+          <w:tcPr>
+            <w:tcW w:w="793" w:type="pct"/>
+            <w:tcMar>
+              <w:top w:w="80" w:type="dxa"/>
+              <w:left w:w="100" w:type="dxa"/>
+              <w:bottom w:w="80" w:type="dxa"/>
+              <w:right w:w="100" w:type="dxa"/>
+            </w:tcMar>
+            <w:vAlign w:val="center"/>
+          </w:tcPr>
+          <w:p>
+            <w:pPr>
+              <w:jc w:val="center"/>
+            </w:pPr>
+          </w:p>
+        </w:tc>
+      </w:tr>
+    </w:tbl>
+    <w:p>
+      <w:pPr>
+        <w:spacing w:before="200" w:after="100"/>
+      </w:pPr>
+      <w:r>
+        <w:rPr>
+          <w:b/>
+          <w:bCs/>
+          <w:color w:val="000000"/>
+        </w:rPr>
+        <w:t xml:space="preserve">C. </w:t>
+      </w:r>
+      <w:proofErr w:type="spellStart"/>
+      <w:r>
+        <w:rPr>
+          <w:b/>
+          <w:bCs/>
+          <w:color w:val="000000"/>
+        </w:rPr>
+        <w:t>Pengalaman</w:t>
+      </w:r>
+      <w:proofErr w:type="spellEnd"/>
+      <w:r>
+        <w:rPr>
+          <w:b/>
+          <w:bCs/>
+          <w:color w:val="000000"/>
+        </w:rPr>
+        <w:t xml:space="preserve"> </w:t>
+      </w:r>
+      <w:proofErr w:type="spellStart"/>
+      <w:r>
+        <w:rPr>
+          <w:b/>
+          <w:bCs/>
+          <w:color w:val="000000"/>
+        </w:rPr>
+        <w:t>Organisasi</w:t>
+      </w:r>
+      <w:proofErr w:type="spellEnd"/>
+      <w:r>
+        <w:rPr>
+          <w:b/>
+          <w:bCs/>
+          <w:color w:val="000000"/>
+        </w:rPr>
+        <w:t xml:space="preserve"> &amp; </w:t>
+      </w:r>
+      <w:proofErr w:type="spellStart"/>
+      <w:r>
+        <w:rPr>
+          <w:b/>
+          <w:bCs/>
+          <w:color w:val="000000"/>
+        </w:rPr>
+        <w:t>Kerja</w:t>
+      </w:r>
+      <w:proofErr w:type="spellEnd"/>
+      <w:r>
+        <w:rPr>
+          <w:b/>
+          <w:bCs/>
+          <w:color w:val="000000"/>
+        </w:rPr>
+        <w:t xml:space="preserve"> </w:t>
+      </w:r>
+      <w:proofErr w:type="spellStart"/>
+      <w:r>
+        <w:rPr>
+          <w:b/>
+          <w:bCs/>
+          <w:color w:val="000000"/>
+        </w:rPr>
+        <w:t>Praktik</w:t>
+      </w:r>
+      <w:proofErr w:type="spellEnd"/>
+    </w:p>
+    <w:tbl>
+      <w:tblPr>
+        <w:tblW w:w="5000" w:type="pct"/>
+        <w:tblBorders>
+          <w:top w:val="single" w:sz="2" w:space="0" w:color="999999"/>
+          <w:left w:val="single" w:sz="2" w:space="0" w:color="999999"/>
+          <w:bottom w:val="single" w:sz="2" w:space="0" w:color="999999"/>
+          <w:right w:val="single" w:sz="2" w:space="0" w:color="999999"/>
+          <w:insideH w:val="single" w:sz="2" w:space="0" w:color="999999"/>
+          <w:insideV w:val="single" w:sz="2" w:space="0" w:color="999999"/>
+        </w:tblBorders>
+        <w:tblCellMar>
+          <w:left w:w="10" w:type="dxa"/>
+          <w:right w:w="10" w:type="dxa"/>
+        </w:tblCellMar>
+        <w:tblLook w:val="04A0" w:firstRow="1" w:lastRow="0" w:firstColumn="1" w:lastColumn="0" w:noHBand="0" w:noVBand="1"/>
+      </w:tblPr>
+      <w:tblGrid>
+        <w:gridCol w:w="592"/>
+        <w:gridCol w:w="4140"/>
+        <w:gridCol w:w="3430"/>
+        <w:gridCol w:w="1538"/>
+      </w:tblGrid>
+      <w:tr>
+        <w:tblPrEx>
+          <w:tblCellMar>
+            <w:top w:w="0" w:type="dxa"/>
+            <w:bottom w:w="0" w:type="dxa"/>
+          </w:tblCellMar>
+        </w:tblPrEx>
+        <w:trPr>
+          <w:tblHeader/>
+        </w:trPr>
+        <w:tc>
+          <w:tcPr>
+            <w:tcW w:w="305" w:type="pct"/>
+            <w:shd w:val="clear" w:color="auto" w:fill="E8E8E8"/>
+            <w:tcMar>
+              <w:top w:w="80" w:type="dxa"/>
+              <w:left w:w="100" w:type="dxa"/>
+              <w:bottom w:w="80" w:type="dxa"/>
+              <w:right w:w="100" w:type="dxa"/>
+            </w:tcMar>
+            <w:vAlign w:val="center"/>
+          </w:tcPr>
+          <w:p>
+            <w:pPr>
+              <w:jc w:val="center"/>
+            </w:pPr>
+            <w:r>
+              <w:rPr>
+                <w:b/>
+                <w:bCs/>
+                <w:sz w:val="20"/>
+                <w:szCs w:val="20"/>
+              </w:rPr>
+              <w:t>No</w:t>
+            </w:r>
+          </w:p>
+        </w:tc>
+        <w:tc>
+          <w:tcPr>
+            <w:tcW w:w="2134" w:type="pct"/>
+            <w:shd w:val="clear" w:color="auto" w:fill="E8E8E8"/>
+            <w:tcMar>
+              <w:top w:w="80" w:type="dxa"/>
+              <w:left w:w="100" w:type="dxa"/>
+              <w:bottom w:w="80" w:type="dxa"/>
+              <w:right w:w="100" w:type="dxa"/>
+            </w:tcMar>
+            <w:vAlign w:val="center"/>
+          </w:tcPr>
+          <w:p>
+            <w:pPr>
+              <w:jc w:val="center"/>
+            </w:pPr>
+            <w:r>
+              <w:rPr>
+                <w:b/>
+                <w:bCs/>
+                <w:sz w:val="20"/>
+                <w:szCs w:val="20"/>
+              </w:rPr>
+              <w:t xml:space="preserve">Nama </w:t>
+            </w:r>
+            <w:proofErr w:type="spellStart"/>
+            <w:r>
+              <w:rPr>
+                <w:b/>
+                <w:bCs/>
+                <w:sz w:val="20"/>
+                <w:szCs w:val="20"/>
+              </w:rPr>
+              <w:t>Kegiatan</w:t>
             </w:r>
             <w:proofErr w:type="spellEnd"/>
           </w:p>
         </w:tc>
         <w:tc>
           <w:tcPr>
-            <w:tcW w:w="1300" w:type="dxa"/>
+            <w:tcW w:w="1768" w:type="pct"/>
             <w:shd w:val="clear" w:color="auto" w:fill="E8E8E8"/>
             <w:tcMar>
               <w:top w:w="80" w:type="dxa"/>
@@ -2913,14 +3124,14 @@
                 <w:sz w:val="20"/>
                 <w:szCs w:val="20"/>
               </w:rPr>
-              <w:t>Tahun</w:t>
+              <w:t>Penyelenggara</w:t>
             </w:r>
             <w:proofErr w:type="spellEnd"/>
           </w:p>
         </w:tc>
         <w:tc>
           <w:tcPr>
-            <w:tcW w:w="1600" w:type="dxa"/>
+            <w:tcW w:w="793" w:type="pct"/>
             <w:shd w:val="clear" w:color="auto" w:fill="E8E8E8"/>
             <w:tcMar>
               <w:top w:w="80" w:type="dxa"/>
@@ -2942,25 +3153,22 @@
                 <w:sz w:val="20"/>
                 <w:szCs w:val="20"/>
               </w:rPr>
-              <w:t>Bobot</w:t>
+              <w:t>Tahun</w:t>
             </w:r>
             <w:proofErr w:type="spellEnd"/>
-            <w:r>
-              <w:rPr>
-                <w:b/>
-                <w:bCs/>
-                <w:sz w:val="20"/>
-                <w:szCs w:val="20"/>
-              </w:rPr>
-              <w:t xml:space="preserve"> Nilai</w:t>
-            </w:r>
           </w:p>
         </w:tc>
       </w:tr>
       <w:tr>
+        <w:tblPrEx>
+          <w:tblCellMar>
+            <w:top w:w="0" w:type="dxa"/>
+            <w:bottom w:w="0" w:type="dxa"/>
+          </w:tblCellMar>
+        </w:tblPrEx>
         <w:tc>
           <w:tcPr>
-            <w:tcW w:w="500" w:type="dxa"/>
+            <w:tcW w:w="305" w:type="pct"/>
             <w:tcMar>
               <w:top w:w="80" w:type="dxa"/>
               <w:left w:w="100" w:type="dxa"/>
@@ -2984,7 +3192,7 @@
         </w:tc>
         <w:tc>
           <w:tcPr>
-            <w:tcW w:w="3500" w:type="dxa"/>
+            <w:tcW w:w="2134" w:type="pct"/>
             <w:tcMar>
               <w:top w:w="80" w:type="dxa"/>
               <w:left w:w="100" w:type="dxa"/>
@@ -2993,19 +3201,11 @@
             </w:tcMar>
             <w:vAlign w:val="center"/>
           </w:tcPr>
-          <w:p>
-            <w:r>
-              <w:rPr>
-                <w:sz w:val="20"/>
-                <w:szCs w:val="20"/>
-              </w:rPr>
-              <w:t>……………………………</w:t>
-            </w:r>
-          </w:p>
+          <w:p/>
         </w:tc>
         <w:tc>
           <w:tcPr>
-            <w:tcW w:w="2900" w:type="dxa"/>
+            <w:tcW w:w="1768" w:type="pct"/>
             <w:tcMar>
               <w:top w:w="80" w:type="dxa"/>
               <w:left w:w="100" w:type="dxa"/>
@@ -3014,19 +3214,11 @@
             </w:tcMar>
             <w:vAlign w:val="center"/>
           </w:tcPr>
-          <w:p>
-            <w:r>
-              <w:rPr>
-                <w:sz w:val="20"/>
-                <w:szCs w:val="20"/>
-              </w:rPr>
-              <w:t>……………………………</w:t>
-            </w:r>
-          </w:p>
+          <w:p/>
         </w:tc>
         <w:tc>
           <w:tcPr>
-            <w:tcW w:w="1300" w:type="dxa"/>
+            <w:tcW w:w="793" w:type="pct"/>
             <w:tcMar>
               <w:top w:w="80" w:type="dxa"/>
               <w:left w:w="100" w:type="dxa"/>
@@ -3039,421 +3231,6 @@
             <w:pPr>
               <w:jc w:val="center"/>
             </w:pPr>
-            <w:r>
-              <w:rPr>
-                <w:sz w:val="20"/>
-                <w:szCs w:val="20"/>
-              </w:rPr>
-              <w:t>………</w:t>
-            </w:r>
-          </w:p>
-        </w:tc>
-        <w:tc>
-          <w:tcPr>
-            <w:tcW w:w="1600" w:type="dxa"/>
-            <w:tcMar>
-              <w:top w:w="80" w:type="dxa"/>
-              <w:left w:w="100" w:type="dxa"/>
-              <w:bottom w:w="80" w:type="dxa"/>
-              <w:right w:w="100" w:type="dxa"/>
-            </w:tcMar>
-            <w:vAlign w:val="center"/>
-          </w:tcPr>
-          <w:p>
-            <w:pPr>
-              <w:jc w:val="center"/>
-            </w:pPr>
-            <w:r>
-              <w:rPr>
-                <w:sz w:val="20"/>
-                <w:szCs w:val="20"/>
-              </w:rPr>
-              <w:t>………</w:t>
-            </w:r>
-          </w:p>
-        </w:tc>
-      </w:tr>
-    </w:tbl>
-    <w:p>
-      <w:pPr>
-        <w:spacing w:before="200" w:after="100"/>
-      </w:pPr>
-      <w:r>
-        <w:rPr>
-          <w:b/>
-          <w:bCs/>
-          <w:color w:val="000000"/>
-        </w:rPr>
-        <w:t xml:space="preserve">C. </w:t>
-      </w:r>
-      <w:proofErr w:type="spellStart"/>
-      <w:r>
-        <w:rPr>
-          <w:b/>
-          <w:bCs/>
-          <w:color w:val="000000"/>
-        </w:rPr>
-        <w:t>Pengalaman</w:t>
-      </w:r>
-      <w:proofErr w:type="spellEnd"/>
-      <w:r>
-        <w:rPr>
-          <w:b/>
-          <w:bCs/>
-          <w:color w:val="000000"/>
-        </w:rPr>
-        <w:t xml:space="preserve"> </w:t>
-      </w:r>
-      <w:proofErr w:type="spellStart"/>
-      <w:r>
-        <w:rPr>
-          <w:b/>
-          <w:bCs/>
-          <w:color w:val="000000"/>
-        </w:rPr>
-        <w:t>Organisasi</w:t>
-      </w:r>
-      <w:proofErr w:type="spellEnd"/>
-      <w:r>
-        <w:rPr>
-          <w:b/>
-          <w:bCs/>
-          <w:color w:val="000000"/>
-        </w:rPr>
-        <w:t xml:space="preserve"> &amp; </w:t>
-      </w:r>
-      <w:proofErr w:type="spellStart"/>
-      <w:r>
-        <w:rPr>
-          <w:b/>
-          <w:bCs/>
-          <w:color w:val="000000"/>
-        </w:rPr>
-        <w:t>Kerja</w:t>
-      </w:r>
-      <w:proofErr w:type="spellEnd"/>
-      <w:r>
-        <w:rPr>
-          <w:b/>
-          <w:bCs/>
-          <w:color w:val="000000"/>
-        </w:rPr>
-        <w:t xml:space="preserve"> </w:t>
-      </w:r>
-      <w:proofErr w:type="spellStart"/>
-      <w:r>
-        <w:rPr>
-          <w:b/>
-          <w:bCs/>
-          <w:color w:val="000000"/>
-        </w:rPr>
-        <w:t>Praktik</w:t>
-      </w:r>
-      <w:proofErr w:type="spellEnd"/>
-    </w:p>
-    <w:tbl>
-      <w:tblPr>
-        <w:tblW w:w="9800" w:type="dxa"/>
-        <w:tblBorders>
-          <w:top w:val="single" w:sz="2" w:space="0" w:color="999999"/>
-          <w:left w:val="single" w:sz="2" w:space="0" w:color="999999"/>
-          <w:bottom w:val="single" w:sz="2" w:space="0" w:color="999999"/>
-          <w:right w:val="single" w:sz="2" w:space="0" w:color="999999"/>
-          <w:insideH w:val="single" w:sz="2" w:space="0" w:color="999999"/>
-          <w:insideV w:val="single" w:sz="2" w:space="0" w:color="999999"/>
-        </w:tblBorders>
-        <w:tblCellMar>
-          <w:left w:w="10" w:type="dxa"/>
-          <w:right w:w="10" w:type="dxa"/>
-        </w:tblCellMar>
-        <w:tblLook w:val="0000" w:firstRow="0" w:lastRow="0" w:firstColumn="0" w:lastColumn="0" w:noHBand="0" w:noVBand="0"/>
-      </w:tblPr>
-      <w:tblGrid>
-        <w:gridCol w:w="500"/>
-        <w:gridCol w:w="3500"/>
-        <w:gridCol w:w="2900"/>
-        <w:gridCol w:w="1300"/>
-        <w:gridCol w:w="1600"/>
-      </w:tblGrid>
-      <w:tr>
-        <w:trPr>
-          <w:tblHeader/>
-        </w:trPr>
-        <w:tc>
-          <w:tcPr>
-            <w:tcW w:w="500" w:type="dxa"/>
-            <w:shd w:val="clear" w:color="auto" w:fill="E8E8E8"/>
-            <w:tcMar>
-              <w:top w:w="80" w:type="dxa"/>
-              <w:left w:w="100" w:type="dxa"/>
-              <w:bottom w:w="80" w:type="dxa"/>
-              <w:right w:w="100" w:type="dxa"/>
-            </w:tcMar>
-            <w:vAlign w:val="center"/>
-          </w:tcPr>
-          <w:p>
-            <w:pPr>
-              <w:jc w:val="center"/>
-            </w:pPr>
-            <w:r>
-              <w:rPr>
-                <w:b/>
-                <w:bCs/>
-                <w:sz w:val="20"/>
-                <w:szCs w:val="20"/>
-              </w:rPr>
-              <w:t>No</w:t>
-            </w:r>
-          </w:p>
-        </w:tc>
-        <w:tc>
-          <w:tcPr>
-            <w:tcW w:w="3500" w:type="dxa"/>
-            <w:shd w:val="clear" w:color="auto" w:fill="E8E8E8"/>
-            <w:tcMar>
-              <w:top w:w="80" w:type="dxa"/>
-              <w:left w:w="100" w:type="dxa"/>
-              <w:bottom w:w="80" w:type="dxa"/>
-              <w:right w:w="100" w:type="dxa"/>
-            </w:tcMar>
-            <w:vAlign w:val="center"/>
-          </w:tcPr>
-          <w:p>
-            <w:pPr>
-              <w:jc w:val="center"/>
-            </w:pPr>
-            <w:r>
-              <w:rPr>
-                <w:b/>
-                <w:bCs/>
-                <w:sz w:val="20"/>
-                <w:szCs w:val="20"/>
-              </w:rPr>
-              <w:t xml:space="preserve">Nama </w:t>
-            </w:r>
-            <w:proofErr w:type="spellStart"/>
-            <w:r>
-              <w:rPr>
-                <w:b/>
-                <w:bCs/>
-                <w:sz w:val="20"/>
-                <w:szCs w:val="20"/>
-              </w:rPr>
-              <w:t>Kegiatan</w:t>
-            </w:r>
-            <w:proofErr w:type="spellEnd"/>
-          </w:p>
-        </w:tc>
-        <w:tc>
-          <w:tcPr>
-            <w:tcW w:w="2900" w:type="dxa"/>
-            <w:shd w:val="clear" w:color="auto" w:fill="E8E8E8"/>
-            <w:tcMar>
-              <w:top w:w="80" w:type="dxa"/>
-              <w:left w:w="100" w:type="dxa"/>
-              <w:bottom w:w="80" w:type="dxa"/>
-              <w:right w:w="100" w:type="dxa"/>
-            </w:tcMar>
-            <w:vAlign w:val="center"/>
-          </w:tcPr>
-          <w:p>
-            <w:pPr>
-              <w:jc w:val="center"/>
-            </w:pPr>
-            <w:proofErr w:type="spellStart"/>
-            <w:r>
-              <w:rPr>
-                <w:b/>
-                <w:bCs/>
-                <w:sz w:val="20"/>
-                <w:szCs w:val="20"/>
-              </w:rPr>
-              <w:t>Penyelenggara</w:t>
-            </w:r>
-            <w:proofErr w:type="spellEnd"/>
-          </w:p>
-        </w:tc>
-        <w:tc>
-          <w:tcPr>
-            <w:tcW w:w="1300" w:type="dxa"/>
-            <w:shd w:val="clear" w:color="auto" w:fill="E8E8E8"/>
-            <w:tcMar>
-              <w:top w:w="80" w:type="dxa"/>
-              <w:left w:w="100" w:type="dxa"/>
-              <w:bottom w:w="80" w:type="dxa"/>
-              <w:right w:w="100" w:type="dxa"/>
-            </w:tcMar>
-            <w:vAlign w:val="center"/>
-          </w:tcPr>
-          <w:p>
-            <w:pPr>
-              <w:jc w:val="center"/>
-            </w:pPr>
-            <w:proofErr w:type="spellStart"/>
-            <w:r>
-              <w:rPr>
-                <w:b/>
-                <w:bCs/>
-                <w:sz w:val="20"/>
-                <w:szCs w:val="20"/>
-              </w:rPr>
-              <w:t>Tahun</w:t>
-            </w:r>
-            <w:proofErr w:type="spellEnd"/>
-          </w:p>
-        </w:tc>
-        <w:tc>
-          <w:tcPr>
-            <w:tcW w:w="1600" w:type="dxa"/>
-            <w:shd w:val="clear" w:color="auto" w:fill="E8E8E8"/>
-            <w:tcMar>
-              <w:top w:w="80" w:type="dxa"/>
-              <w:left w:w="100" w:type="dxa"/>
-              <w:bottom w:w="80" w:type="dxa"/>
-              <w:right w:w="100" w:type="dxa"/>
-            </w:tcMar>
-            <w:vAlign w:val="center"/>
-          </w:tcPr>
-          <w:p>
-            <w:pPr>
-              <w:jc w:val="center"/>
-            </w:pPr>
-            <w:proofErr w:type="spellStart"/>
-            <w:r>
-              <w:rPr>
-                <w:b/>
-                <w:bCs/>
-                <w:sz w:val="20"/>
-                <w:szCs w:val="20"/>
-              </w:rPr>
-              <w:t>Bobot</w:t>
-            </w:r>
-            <w:proofErr w:type="spellEnd"/>
-            <w:r>
-              <w:rPr>
-                <w:b/>
-                <w:bCs/>
-                <w:sz w:val="20"/>
-                <w:szCs w:val="20"/>
-              </w:rPr>
-              <w:t xml:space="preserve"> Nilai</w:t>
-            </w:r>
-          </w:p>
-        </w:tc>
-      </w:tr>
-      <w:tr>
-        <w:tc>
-          <w:tcPr>
-            <w:tcW w:w="500" w:type="dxa"/>
-            <w:tcMar>
-              <w:top w:w="80" w:type="dxa"/>
-              <w:left w:w="100" w:type="dxa"/>
-              <w:bottom w:w="80" w:type="dxa"/>
-              <w:right w:w="100" w:type="dxa"/>
-            </w:tcMar>
-            <w:vAlign w:val="center"/>
-          </w:tcPr>
-          <w:p>
-            <w:pPr>
-              <w:jc w:val="center"/>
-            </w:pPr>
-            <w:r>
-              <w:rPr>
-                <w:sz w:val="20"/>
-                <w:szCs w:val="20"/>
-              </w:rPr>
-              <w:t>1</w:t>
-            </w:r>
-          </w:p>
-        </w:tc>
-        <w:tc>
-          <w:tcPr>
-            <w:tcW w:w="3500" w:type="dxa"/>
-            <w:tcMar>
-              <w:top w:w="80" w:type="dxa"/>
-              <w:left w:w="100" w:type="dxa"/>
-              <w:bottom w:w="80" w:type="dxa"/>
-              <w:right w:w="100" w:type="dxa"/>
-            </w:tcMar>
-            <w:vAlign w:val="center"/>
-          </w:tcPr>
-          <w:p>
-            <w:r>
-              <w:rPr>
-                <w:sz w:val="20"/>
-                <w:szCs w:val="20"/>
-              </w:rPr>
-              <w:t>……………………………</w:t>
-            </w:r>
-          </w:p>
-        </w:tc>
-        <w:tc>
-          <w:tcPr>
-            <w:tcW w:w="2900" w:type="dxa"/>
-            <w:tcMar>
-              <w:top w:w="80" w:type="dxa"/>
-              <w:left w:w="100" w:type="dxa"/>
-              <w:bottom w:w="80" w:type="dxa"/>
-              <w:right w:w="100" w:type="dxa"/>
-            </w:tcMar>
-            <w:vAlign w:val="center"/>
-          </w:tcPr>
-          <w:p>
-            <w:r>
-              <w:rPr>
-                <w:sz w:val="20"/>
-                <w:szCs w:val="20"/>
-              </w:rPr>
-              <w:t>……………………………</w:t>
-            </w:r>
-          </w:p>
-        </w:tc>
-        <w:tc>
-          <w:tcPr>
-            <w:tcW w:w="1300" w:type="dxa"/>
-            <w:tcMar>
-              <w:top w:w="80" w:type="dxa"/>
-              <w:left w:w="100" w:type="dxa"/>
-              <w:bottom w:w="80" w:type="dxa"/>
-              <w:right w:w="100" w:type="dxa"/>
-            </w:tcMar>
-            <w:vAlign w:val="center"/>
-          </w:tcPr>
-          <w:p>
-            <w:pPr>
-              <w:jc w:val="center"/>
-            </w:pPr>
-            <w:r>
-              <w:rPr>
-                <w:sz w:val="20"/>
-                <w:szCs w:val="20"/>
-              </w:rPr>
-              <w:t>………</w:t>
-            </w:r>
-          </w:p>
-        </w:tc>
-        <w:tc>
-          <w:tcPr>
-            <w:tcW w:w="1600" w:type="dxa"/>
-            <w:tcMar>
-              <w:top w:w="80" w:type="dxa"/>
-              <w:left w:w="100" w:type="dxa"/>
-              <w:bottom w:w="80" w:type="dxa"/>
-              <w:right w:w="100" w:type="dxa"/>
-            </w:tcMar>
-            <w:vAlign w:val="center"/>
-          </w:tcPr>
-          <w:p>
-            <w:pPr>
-              <w:jc w:val="center"/>
-            </w:pPr>
-            <w:r>
-              <w:rPr>
-                <w:sz w:val="20"/>
-                <w:szCs w:val="20"/>
-              </w:rPr>
-              <w:t>………</w:t>
-            </w:r>
           </w:p>
         </w:tc>
       </w:tr>
@@ -3848,10 +3625,64 @@
 <file path=word/numbering.xml><?xml version="1.0" encoding="utf-8"?>
 <w:numbering xmlns:wpc="http://schemas.microsoft.com/office/word/2010/wordprocessingCanvas" xmlns:cx="http://schemas.microsoft.com/office/drawing/2014/chartex" xmlns:cx1="http://schemas.microsoft.com/office/drawing/2015/9/8/chartex" xmlns:cx2="http://schemas.microsoft.com/office/drawing/2015/10/21/chartex" xmlns:cx3="http://schemas.microsoft.com/office/drawing/2016/5/9/chartex" xmlns:cx4="http://schemas.microsoft.com/office/drawing/2016/5/10/chartex" xmlns:cx5="http://schemas.microsoft.com/office/drawing/2016/5/11/chartex" xmlns:cx6="http://schemas.microsoft.com/office/drawing/2016/5/12/chartex" xmlns:cx7="http://schemas.microsoft.com/office/drawing/2016/5/13/chartex" xmlns:cx8="http://schemas.microsoft.com/office/drawing/2016/5/14/chartex" xmlns:mc="http://schemas.openxmlformats.org/markup-compatibility/2006" xmlns:aink="http://schemas.microsoft.com/office/drawing/2016/ink" xmlns:am3d="http://schemas.microsoft.com/office/drawing/2017/model3d" xmlns:o="urn:schemas-microsoft-com:office:office" xmlns:oel="http://schemas.microsoft.com/office/2019/extlst" xmlns:r="http://schemas.openxmlformats.org/officeDocument/2006/relationships" xmlns:m="http://schemas.openxmlformats.org/officeDocument/2006/math" xmlns:v="urn:schemas-microsoft-com:vml" xmlns:wp14="http://schemas.microsoft.com/office/word/2010/wordprocessingDrawing" xmlns:wp="http://schemas.openxmlformats.org/drawingml/2006/wordprocessingDrawing" xmlns:w10="urn:schemas-microsoft-com:office:word" xmlns:w="http://schemas.openxmlformats.org/wordprocessingml/2006/main" xmlns:w14="http://schemas.microsoft.com/office/word/2010/wordml" xmlns:w15="http://schemas.microsoft.com/office/word/2012/wordml" xmlns:w16cex="http://schemas.microsoft.com/office/word/2018/wordml/cex" xmlns:w16cid="http://schemas.microsoft.com/office/word/2016/wordml/cid" xmlns:w16="http://schemas.microsoft.com/office/word/2018/wordml" xmlns:w16du="http://schemas.microsoft.com/office/word/2023/wordml/word16du" xmlns:w16sdtdh="http://schemas.microsoft.com/office/word/2020/wordml/sdtdatahash" xmlns:w16sdtfl="http://schemas.microsoft.com/office/word/2024/wordml/sdtformatlock" xmlns:w16se="http://schemas.microsoft.com/office/word/2015/wordml/symex" xmlns:wpg="http://schemas.microsoft.com/office/word/2010/wordprocessingGroup" xmlns:wpi="http://schemas.microsoft.com/office/word/2010/wordprocessingInk" xmlns:wne="http://schemas.microsoft.com/office/word/2006/wordml" xmlns:wps="http://schemas.microsoft.com/office/word/2010/wordprocessingShape" mc:Ignorable="w14 w15 w16se w16cid w16 w16cex w16sdtdh w16sdtfl w16du wp14">
   <w:abstractNum w:abstractNumId="0" w15:restartNumberingAfterBreak="0">
-    <w:nsid w:val="33730669"/>
+    <w:nsid w:val="15AE7B8B"/>
     <w:multiLevelType w:val="hybridMultilevel"/>
-    <w:tmpl w:val="1EE6DC1A"/>
-    <w:lvl w:ilvl="0" w:tplc="87AC46F4">
+    <w:tmpl w:val="B5F4CBB8"/>
+    <w:lvl w:ilvl="0" w:tplc="CFC690AC">
+      <w:start w:val="1"/>
+      <w:numFmt w:val="bullet"/>
+      <w:lvlText w:val="•"/>
+      <w:lvlJc w:val="left"/>
+      <w:pPr>
+        <w:ind w:left="400" w:hanging="260"/>
+      </w:pPr>
+    </w:lvl>
+    <w:lvl w:ilvl="1" w:tplc="A53A395C">
+      <w:numFmt w:val="decimal"/>
+      <w:lvlText w:val=""/>
+      <w:lvlJc w:val="left"/>
+    </w:lvl>
+    <w:lvl w:ilvl="2" w:tplc="0D6AE35C">
+      <w:numFmt w:val="decimal"/>
+      <w:lvlText w:val=""/>
+      <w:lvlJc w:val="left"/>
+    </w:lvl>
+    <w:lvl w:ilvl="3" w:tplc="E6D0592E">
+      <w:numFmt w:val="decimal"/>
+      <w:lvlText w:val=""/>
+      <w:lvlJc w:val="left"/>
+    </w:lvl>
+    <w:lvl w:ilvl="4" w:tplc="B3961B00">
+      <w:numFmt w:val="decimal"/>
+      <w:lvlText w:val=""/>
+      <w:lvlJc w:val="left"/>
+    </w:lvl>
+    <w:lvl w:ilvl="5" w:tplc="2146004A">
+      <w:numFmt w:val="decimal"/>
+      <w:lvlText w:val=""/>
+      <w:lvlJc w:val="left"/>
+    </w:lvl>
+    <w:lvl w:ilvl="6" w:tplc="7D4679C4">
+      <w:numFmt w:val="decimal"/>
+      <w:lvlText w:val=""/>
+      <w:lvlJc w:val="left"/>
+    </w:lvl>
+    <w:lvl w:ilvl="7" w:tplc="BB462236">
+      <w:numFmt w:val="decimal"/>
+      <w:lvlText w:val=""/>
+      <w:lvlJc w:val="left"/>
+    </w:lvl>
+    <w:lvl w:ilvl="8" w:tplc="CA62CF38">
+      <w:numFmt w:val="decimal"/>
+      <w:lvlText w:val=""/>
+      <w:lvlJc w:val="left"/>
+    </w:lvl>
+  </w:abstractNum>
+  <w:abstractNum w:abstractNumId="1" w15:restartNumberingAfterBreak="0">
+    <w:nsid w:val="28CA064B"/>
+    <w:multiLevelType w:val="hybridMultilevel"/>
+    <w:tmpl w:val="0C72F752"/>
+    <w:lvl w:ilvl="0" w:tplc="C048FF28">
       <w:start w:val="1"/>
       <w:numFmt w:val="bullet"/>
       <w:lvlText w:val="●"/>
@@ -3860,7 +3691,7 @@
         <w:ind w:left="720" w:hanging="360"/>
       </w:pPr>
     </w:lvl>
-    <w:lvl w:ilvl="1" w:tplc="6D722110">
+    <w:lvl w:ilvl="1" w:tplc="453EEA84">
       <w:start w:val="1"/>
       <w:numFmt w:val="bullet"/>
       <w:lvlText w:val="○"/>
@@ -3869,7 +3700,7 @@
         <w:ind w:left="1440" w:hanging="360"/>
       </w:pPr>
     </w:lvl>
-    <w:lvl w:ilvl="2" w:tplc="C714C262">
+    <w:lvl w:ilvl="2" w:tplc="75000C0E">
       <w:start w:val="1"/>
       <w:numFmt w:val="bullet"/>
       <w:lvlText w:val="■"/>
@@ -3878,7 +3709,7 @@
         <w:ind w:left="2160" w:hanging="360"/>
       </w:pPr>
     </w:lvl>
-    <w:lvl w:ilvl="3" w:tplc="DA2A3596">
+    <w:lvl w:ilvl="3" w:tplc="CA221F32">
       <w:start w:val="1"/>
       <w:numFmt w:val="bullet"/>
       <w:lvlText w:val="●"/>
@@ -3887,7 +3718,7 @@
         <w:ind w:left="2880" w:hanging="360"/>
       </w:pPr>
     </w:lvl>
-    <w:lvl w:ilvl="4" w:tplc="31668A70">
+    <w:lvl w:ilvl="4" w:tplc="4A0E58D6">
       <w:start w:val="1"/>
       <w:numFmt w:val="bullet"/>
       <w:lvlText w:val="○"/>
@@ -3896,7 +3727,7 @@
         <w:ind w:left="3600" w:hanging="360"/>
       </w:pPr>
     </w:lvl>
-    <w:lvl w:ilvl="5" w:tplc="5AF02F76">
+    <w:lvl w:ilvl="5" w:tplc="77580F64">
       <w:start w:val="1"/>
       <w:numFmt w:val="bullet"/>
       <w:lvlText w:val="■"/>
@@ -3905,7 +3736,7 @@
         <w:ind w:left="4320" w:hanging="360"/>
       </w:pPr>
     </w:lvl>
-    <w:lvl w:ilvl="6" w:tplc="2FAE74E8">
+    <w:lvl w:ilvl="6" w:tplc="E1AC3E22">
       <w:start w:val="1"/>
       <w:numFmt w:val="bullet"/>
       <w:lvlText w:val="●"/>
@@ -3914,7 +3745,7 @@
         <w:ind w:left="5040" w:hanging="360"/>
       </w:pPr>
     </w:lvl>
-    <w:lvl w:ilvl="7" w:tplc="7D46631A">
+    <w:lvl w:ilvl="7" w:tplc="EFC63C34">
       <w:start w:val="1"/>
       <w:numFmt w:val="bullet"/>
       <w:lvlText w:val="●"/>
@@ -3923,7 +3754,7 @@
         <w:ind w:left="5760" w:hanging="360"/>
       </w:pPr>
     </w:lvl>
-    <w:lvl w:ilvl="8" w:tplc="65E09AD0">
+    <w:lvl w:ilvl="8" w:tplc="E16EC408">
       <w:start w:val="1"/>
       <w:numFmt w:val="bullet"/>
       <w:lvlText w:val="●"/>
@@ -3933,68 +3764,14 @@
       </w:pPr>
     </w:lvl>
   </w:abstractNum>
-  <w:abstractNum w:abstractNumId="1" w15:restartNumberingAfterBreak="0">
-    <w:nsid w:val="4CCD13F2"/>
-    <w:multiLevelType w:val="hybridMultilevel"/>
-    <w:tmpl w:val="AB22E89E"/>
-    <w:lvl w:ilvl="0" w:tplc="88DA8854">
-      <w:start w:val="1"/>
-      <w:numFmt w:val="bullet"/>
-      <w:lvlText w:val="•"/>
-      <w:lvlJc w:val="left"/>
-      <w:pPr>
-        <w:ind w:left="400" w:hanging="260"/>
-      </w:pPr>
-    </w:lvl>
-    <w:lvl w:ilvl="1" w:tplc="836AE9E8">
-      <w:numFmt w:val="decimal"/>
-      <w:lvlText w:val=""/>
-      <w:lvlJc w:val="left"/>
-    </w:lvl>
-    <w:lvl w:ilvl="2" w:tplc="2884DE56">
-      <w:numFmt w:val="decimal"/>
-      <w:lvlText w:val=""/>
-      <w:lvlJc w:val="left"/>
-    </w:lvl>
-    <w:lvl w:ilvl="3" w:tplc="4DC63426">
-      <w:numFmt w:val="decimal"/>
-      <w:lvlText w:val=""/>
-      <w:lvlJc w:val="left"/>
-    </w:lvl>
-    <w:lvl w:ilvl="4" w:tplc="214CAAE8">
-      <w:numFmt w:val="decimal"/>
-      <w:lvlText w:val=""/>
-      <w:lvlJc w:val="left"/>
-    </w:lvl>
-    <w:lvl w:ilvl="5" w:tplc="3B522CFC">
-      <w:numFmt w:val="decimal"/>
-      <w:lvlText w:val=""/>
-      <w:lvlJc w:val="left"/>
-    </w:lvl>
-    <w:lvl w:ilvl="6" w:tplc="25244C22">
-      <w:numFmt w:val="decimal"/>
-      <w:lvlText w:val=""/>
-      <w:lvlJc w:val="left"/>
-    </w:lvl>
-    <w:lvl w:ilvl="7" w:tplc="35243716">
-      <w:numFmt w:val="decimal"/>
-      <w:lvlText w:val=""/>
-      <w:lvlJc w:val="left"/>
-    </w:lvl>
-    <w:lvl w:ilvl="8" w:tplc="C440676E">
-      <w:numFmt w:val="decimal"/>
-      <w:lvlText w:val=""/>
-      <w:lvlJc w:val="left"/>
-    </w:lvl>
-  </w:abstractNum>
-  <w:num w:numId="1" w16cid:durableId="712459322">
-    <w:abstractNumId w:val="0"/>
+  <w:num w:numId="1" w16cid:durableId="124347715">
+    <w:abstractNumId w:val="1"/>
     <w:lvlOverride w:ilvl="0">
       <w:startOverride w:val="1"/>
     </w:lvlOverride>
   </w:num>
-  <w:num w:numId="2" w16cid:durableId="992441750">
-    <w:abstractNumId w:val="1"/>
+  <w:num w:numId="2" w16cid:durableId="1459882655">
+    <w:abstractNumId w:val="0"/>
     <w:lvlOverride w:ilvl="0">
       <w:startOverride w:val="1"/>
     </w:lvlOverride>

</xml_diff>